<commit_message>
normalize answer and counterclaim font to Times New Roman
</commit_message>
<xml_diff>
--- a/docassemble/VTSuperiorCourtDebtAnswer/data/templates/include_caption.docx
+++ b/docassemble/VTSuperiorCourtDebtAnswer/data/templates/include_caption.docx
@@ -1,6 +1,6 @@
 
 <file path=word/document.xml><?xml version="1.0" encoding="utf-8"?>
-<w:document xmlns:wpc="http://schemas.microsoft.com/office/word/2010/wordprocessingCanvas" xmlns:cx="http://schemas.microsoft.com/office/drawing/2014/chartex" xmlns:cx1="http://schemas.microsoft.com/office/drawing/2015/9/8/chartex" xmlns:cx2="http://schemas.microsoft.com/office/drawing/2015/10/21/chartex" xmlns:cx3="http://schemas.microsoft.com/office/drawing/2016/5/9/chartex" xmlns:cx4="http://schemas.microsoft.com/office/drawing/2016/5/10/chartex" xmlns:cx5="http://schemas.microsoft.com/office/drawing/2016/5/11/chartex" xmlns:cx6="http://schemas.microsoft.com/office/drawing/2016/5/12/chartex" xmlns:cx7="http://schemas.microsoft.com/office/drawing/2016/5/13/chartex" xmlns:cx8="http://schemas.microsoft.com/office/drawing/2016/5/14/chartex" xmlns:mc="http://schemas.openxmlformats.org/markup-compatibility/2006" xmlns:aink="http://schemas.microsoft.com/office/drawing/2016/ink" xmlns:am3d="http://schemas.microsoft.com/office/drawing/2017/model3d" xmlns:o="urn:schemas-microsoft-com:office:office" xmlns:oel="http://schemas.microsoft.com/office/2019/extlst" xmlns:r="http://schemas.openxmlformats.org/officeDocument/2006/relationships" xmlns:m="http://schemas.openxmlformats.org/officeDocument/2006/math" xmlns:v="urn:schemas-microsoft-com:vml" xmlns:wp14="http://schemas.microsoft.com/office/word/2010/wordprocessingDrawing" xmlns:wp="http://schemas.openxmlformats.org/drawingml/2006/wordprocessingDrawing" xmlns:w10="urn:schemas-microsoft-com:office:word" xmlns:w="http://schemas.openxmlformats.org/wordprocessingml/2006/main" xmlns:w14="http://schemas.microsoft.com/office/word/2010/wordml" xmlns:w15="http://schemas.microsoft.com/office/word/2012/wordml" xmlns:w16cex="http://schemas.microsoft.com/office/word/2018/wordml/cex" xmlns:w16cid="http://schemas.microsoft.com/office/word/2016/wordml/cid" xmlns:w16="http://schemas.microsoft.com/office/word/2018/wordml" xmlns:w16du="http://schemas.microsoft.com/office/word/2023/wordml/word16du" xmlns:w16sdtdh="http://schemas.microsoft.com/office/word/2020/wordml/sdtdatahash" xmlns:w16sdtfl="http://schemas.microsoft.com/office/word/2024/wordml/sdtformatlock" xmlns:w16se="http://schemas.microsoft.com/office/word/2015/wordml/symex" xmlns:wpg="http://schemas.microsoft.com/office/word/2010/wordprocessingGroup" xmlns:wpi="http://schemas.microsoft.com/office/word/2010/wordprocessingInk" xmlns:wne="http://schemas.microsoft.com/office/word/2006/wordml" xmlns:wps="http://schemas.microsoft.com/office/word/2010/wordprocessingShape" mc:Ignorable="w14 w15 w16se w16cid w16 w16cex w16sdtdh w16sdtfl w16du wp14">
+<w:document xmlns:wpc="http://schemas.microsoft.com/office/word/2010/wordprocessingCanvas" xmlns:cx="http://schemas.microsoft.com/office/drawing/2014/chartex" xmlns:cx1="http://schemas.microsoft.com/office/drawing/2015/9/8/chartex" xmlns:cx2="http://schemas.microsoft.com/office/drawing/2015/10/21/chartex" xmlns:cx3="http://schemas.microsoft.com/office/drawing/2016/5/9/chartex" xmlns:cx4="http://schemas.microsoft.com/office/drawing/2016/5/10/chartex" xmlns:cx5="http://schemas.microsoft.com/office/drawing/2016/5/11/chartex" xmlns:cx6="http://schemas.microsoft.com/office/drawing/2016/5/12/chartex" xmlns:cx7="http://schemas.microsoft.com/office/drawing/2016/5/13/chartex" xmlns:cx8="http://schemas.microsoft.com/office/drawing/2016/5/14/chartex" xmlns:mc="http://schemas.openxmlformats.org/markup-compatibility/2006" xmlns:m="http://schemas.openxmlformats.org/officeDocument/2006/math" xmlns:aink="http://schemas.microsoft.com/office/drawing/2016/ink" xmlns:am3d="http://schemas.microsoft.com/office/drawing/2017/model3d" xmlns:oel="http://schemas.microsoft.com/office/2019/extlst" xmlns:r="http://schemas.openxmlformats.org/officeDocument/2006/relationships" xmlns:wp14="http://schemas.microsoft.com/office/word/2010/wordprocessingDrawing" xmlns:wp="http://schemas.openxmlformats.org/drawingml/2006/wordprocessingDrawing" xmlns:wpg="http://schemas.microsoft.com/office/word/2010/wordprocessingGroup" xmlns:wpi="http://schemas.microsoft.com/office/word/2010/wordprocessingInk" xmlns:wps="http://schemas.microsoft.com/office/word/2010/wordprocessingShape" xmlns:o="urn:schemas-microsoft-com:office:office" xmlns:v="urn:schemas-microsoft-com:vml" xmlns:w10="urn:schemas-microsoft-com:office:word" xmlns:w="http://schemas.openxmlformats.org/wordprocessingml/2006/main" xmlns:w14="http://schemas.microsoft.com/office/word/2010/wordml" xmlns:w15="http://schemas.microsoft.com/office/word/2012/wordml" xmlns:w16cex="http://schemas.microsoft.com/office/word/2018/wordml/cex" xmlns:w16cid="http://schemas.microsoft.com/office/word/2016/wordml/cid" xmlns:w16="http://schemas.microsoft.com/office/word/2018/wordml" xmlns:w16sdtdh="http://schemas.microsoft.com/office/word/2020/wordml/sdtdatahash" xmlns:w16sdtfl="http://schemas.microsoft.com/office/word/2024/wordml/sdtformatlock" xmlns:w16se="http://schemas.microsoft.com/office/word/2015/wordml/symex" xmlns:w16du="http://schemas.microsoft.com/office/word/2023/wordml/word16du" xmlns:wne="http://schemas.microsoft.com/office/word/2006/wordml" mc:Ignorable="w14 w15 w16se w16cid w16 w16cex w16sdtdh w16sdtfl w16du wp14">
   <w:body>
     <w:p>
       <w:pPr>
@@ -728,7 +728,7 @@
 </file>
 
 <file path=word/endnotes.xml><?xml version="1.0" encoding="utf-8"?>
-<w:endnotes xmlns:wpc="http://schemas.microsoft.com/office/word/2010/wordprocessingCanvas" xmlns:cx="http://schemas.microsoft.com/office/drawing/2014/chartex" xmlns:cx1="http://schemas.microsoft.com/office/drawing/2015/9/8/chartex" xmlns:cx2="http://schemas.microsoft.com/office/drawing/2015/10/21/chartex" xmlns:cx3="http://schemas.microsoft.com/office/drawing/2016/5/9/chartex" xmlns:cx4="http://schemas.microsoft.com/office/drawing/2016/5/10/chartex" xmlns:cx5="http://schemas.microsoft.com/office/drawing/2016/5/11/chartex" xmlns:cx6="http://schemas.microsoft.com/office/drawing/2016/5/12/chartex" xmlns:cx7="http://schemas.microsoft.com/office/drawing/2016/5/13/chartex" xmlns:cx8="http://schemas.microsoft.com/office/drawing/2016/5/14/chartex" xmlns:mc="http://schemas.openxmlformats.org/markup-compatibility/2006" xmlns:aink="http://schemas.microsoft.com/office/drawing/2016/ink" xmlns:am3d="http://schemas.microsoft.com/office/drawing/2017/model3d" xmlns:o="urn:schemas-microsoft-com:office:office" xmlns:oel="http://schemas.microsoft.com/office/2019/extlst" xmlns:r="http://schemas.openxmlformats.org/officeDocument/2006/relationships" xmlns:m="http://schemas.openxmlformats.org/officeDocument/2006/math" xmlns:v="urn:schemas-microsoft-com:vml" xmlns:wp14="http://schemas.microsoft.com/office/word/2010/wordprocessingDrawing" xmlns:wp="http://schemas.openxmlformats.org/drawingml/2006/wordprocessingDrawing" xmlns:w10="urn:schemas-microsoft-com:office:word" xmlns:w="http://schemas.openxmlformats.org/wordprocessingml/2006/main" xmlns:w14="http://schemas.microsoft.com/office/word/2010/wordml" xmlns:w15="http://schemas.microsoft.com/office/word/2012/wordml" xmlns:w16cex="http://schemas.microsoft.com/office/word/2018/wordml/cex" xmlns:w16cid="http://schemas.microsoft.com/office/word/2016/wordml/cid" xmlns:w16="http://schemas.microsoft.com/office/word/2018/wordml" xmlns:w16du="http://schemas.microsoft.com/office/word/2023/wordml/word16du" xmlns:w16sdtdh="http://schemas.microsoft.com/office/word/2020/wordml/sdtdatahash" xmlns:w16sdtfl="http://schemas.microsoft.com/office/word/2024/wordml/sdtformatlock" xmlns:w16se="http://schemas.microsoft.com/office/word/2015/wordml/symex" xmlns:wpg="http://schemas.microsoft.com/office/word/2010/wordprocessingGroup" xmlns:wpi="http://schemas.microsoft.com/office/word/2010/wordprocessingInk" xmlns:wne="http://schemas.microsoft.com/office/word/2006/wordml" xmlns:wps="http://schemas.microsoft.com/office/word/2010/wordprocessingShape" mc:Ignorable="w14 w15 w16se w16cid w16 w16cex w16sdtdh w16sdtfl w16du wp14">
+<w:endnotes xmlns:wpc="http://schemas.microsoft.com/office/word/2010/wordprocessingCanvas" xmlns:cx="http://schemas.microsoft.com/office/drawing/2014/chartex" xmlns:cx1="http://schemas.microsoft.com/office/drawing/2015/9/8/chartex" xmlns:cx2="http://schemas.microsoft.com/office/drawing/2015/10/21/chartex" xmlns:cx3="http://schemas.microsoft.com/office/drawing/2016/5/9/chartex" xmlns:cx4="http://schemas.microsoft.com/office/drawing/2016/5/10/chartex" xmlns:cx5="http://schemas.microsoft.com/office/drawing/2016/5/11/chartex" xmlns:cx6="http://schemas.microsoft.com/office/drawing/2016/5/12/chartex" xmlns:cx7="http://schemas.microsoft.com/office/drawing/2016/5/13/chartex" xmlns:cx8="http://schemas.microsoft.com/office/drawing/2016/5/14/chartex" xmlns:mc="http://schemas.openxmlformats.org/markup-compatibility/2006" xmlns:m="http://schemas.openxmlformats.org/officeDocument/2006/math" xmlns:aink="http://schemas.microsoft.com/office/drawing/2016/ink" xmlns:am3d="http://schemas.microsoft.com/office/drawing/2017/model3d" xmlns:oel="http://schemas.microsoft.com/office/2019/extlst" xmlns:r="http://schemas.openxmlformats.org/officeDocument/2006/relationships" xmlns:wp14="http://schemas.microsoft.com/office/word/2010/wordprocessingDrawing" xmlns:wp="http://schemas.openxmlformats.org/drawingml/2006/wordprocessingDrawing" xmlns:wpg="http://schemas.microsoft.com/office/word/2010/wordprocessingGroup" xmlns:wpi="http://schemas.microsoft.com/office/word/2010/wordprocessingInk" xmlns:wps="http://schemas.microsoft.com/office/word/2010/wordprocessingShape" xmlns:o="urn:schemas-microsoft-com:office:office" xmlns:v="urn:schemas-microsoft-com:vml" xmlns:w10="urn:schemas-microsoft-com:office:word" xmlns:w="http://schemas.openxmlformats.org/wordprocessingml/2006/main" xmlns:w14="http://schemas.microsoft.com/office/word/2010/wordml" xmlns:w15="http://schemas.microsoft.com/office/word/2012/wordml" xmlns:w16cex="http://schemas.microsoft.com/office/word/2018/wordml/cex" xmlns:w16cid="http://schemas.microsoft.com/office/word/2016/wordml/cid" xmlns:w16="http://schemas.microsoft.com/office/word/2018/wordml" xmlns:w16sdtdh="http://schemas.microsoft.com/office/word/2020/wordml/sdtdatahash" xmlns:w16sdtfl="http://schemas.microsoft.com/office/word/2024/wordml/sdtformatlock" xmlns:w16se="http://schemas.microsoft.com/office/word/2015/wordml/symex" xmlns:w16du="http://schemas.microsoft.com/office/word/2023/wordml/word16du" xmlns:wne="http://schemas.microsoft.com/office/word/2006/wordml" mc:Ignorable="w14 w15 w16se w16cid w16 w16cex w16sdtdh w16sdtfl w16du wp14">
   <w:endnote w:type="separator" w:id="-1">
     <w:p>
       <w:r>
@@ -750,7 +750,7 @@
 </file>
 
 <file path=word/footer1.xml><?xml version="1.0" encoding="utf-8"?>
-<w:ftr xmlns:wpc="http://schemas.microsoft.com/office/word/2010/wordprocessingCanvas" xmlns:cx="http://schemas.microsoft.com/office/drawing/2014/chartex" xmlns:cx1="http://schemas.microsoft.com/office/drawing/2015/9/8/chartex" xmlns:cx2="http://schemas.microsoft.com/office/drawing/2015/10/21/chartex" xmlns:cx3="http://schemas.microsoft.com/office/drawing/2016/5/9/chartex" xmlns:cx4="http://schemas.microsoft.com/office/drawing/2016/5/10/chartex" xmlns:cx5="http://schemas.microsoft.com/office/drawing/2016/5/11/chartex" xmlns:cx6="http://schemas.microsoft.com/office/drawing/2016/5/12/chartex" xmlns:cx7="http://schemas.microsoft.com/office/drawing/2016/5/13/chartex" xmlns:cx8="http://schemas.microsoft.com/office/drawing/2016/5/14/chartex" xmlns:mc="http://schemas.openxmlformats.org/markup-compatibility/2006" xmlns:aink="http://schemas.microsoft.com/office/drawing/2016/ink" xmlns:am3d="http://schemas.microsoft.com/office/drawing/2017/model3d" xmlns:o="urn:schemas-microsoft-com:office:office" xmlns:oel="http://schemas.microsoft.com/office/2019/extlst" xmlns:r="http://schemas.openxmlformats.org/officeDocument/2006/relationships" xmlns:m="http://schemas.openxmlformats.org/officeDocument/2006/math" xmlns:v="urn:schemas-microsoft-com:vml" xmlns:wp14="http://schemas.microsoft.com/office/word/2010/wordprocessingDrawing" xmlns:wp="http://schemas.openxmlformats.org/drawingml/2006/wordprocessingDrawing" xmlns:w10="urn:schemas-microsoft-com:office:word" xmlns:w="http://schemas.openxmlformats.org/wordprocessingml/2006/main" xmlns:w14="http://schemas.microsoft.com/office/word/2010/wordml" xmlns:w15="http://schemas.microsoft.com/office/word/2012/wordml" xmlns:w16cex="http://schemas.microsoft.com/office/word/2018/wordml/cex" xmlns:w16cid="http://schemas.microsoft.com/office/word/2016/wordml/cid" xmlns:w16="http://schemas.microsoft.com/office/word/2018/wordml" xmlns:w16du="http://schemas.microsoft.com/office/word/2023/wordml/word16du" xmlns:w16sdtdh="http://schemas.microsoft.com/office/word/2020/wordml/sdtdatahash" xmlns:w16sdtfl="http://schemas.microsoft.com/office/word/2024/wordml/sdtformatlock" xmlns:w16se="http://schemas.microsoft.com/office/word/2015/wordml/symex" xmlns:wpg="http://schemas.microsoft.com/office/word/2010/wordprocessingGroup" xmlns:wpi="http://schemas.microsoft.com/office/word/2010/wordprocessingInk" xmlns:wne="http://schemas.microsoft.com/office/word/2006/wordml" xmlns:wps="http://schemas.microsoft.com/office/word/2010/wordprocessingShape" mc:Ignorable="w14 w15 w16se w16cid w16 w16cex w16sdtdh w16sdtfl w16du wp14">
+<w:ftr xmlns:wpc="http://schemas.microsoft.com/office/word/2010/wordprocessingCanvas" xmlns:cx="http://schemas.microsoft.com/office/drawing/2014/chartex" xmlns:cx1="http://schemas.microsoft.com/office/drawing/2015/9/8/chartex" xmlns:cx2="http://schemas.microsoft.com/office/drawing/2015/10/21/chartex" xmlns:cx3="http://schemas.microsoft.com/office/drawing/2016/5/9/chartex" xmlns:cx4="http://schemas.microsoft.com/office/drawing/2016/5/10/chartex" xmlns:cx5="http://schemas.microsoft.com/office/drawing/2016/5/11/chartex" xmlns:cx6="http://schemas.microsoft.com/office/drawing/2016/5/12/chartex" xmlns:cx7="http://schemas.microsoft.com/office/drawing/2016/5/13/chartex" xmlns:cx8="http://schemas.microsoft.com/office/drawing/2016/5/14/chartex" xmlns:mc="http://schemas.openxmlformats.org/markup-compatibility/2006" xmlns:m="http://schemas.openxmlformats.org/officeDocument/2006/math" xmlns:aink="http://schemas.microsoft.com/office/drawing/2016/ink" xmlns:am3d="http://schemas.microsoft.com/office/drawing/2017/model3d" xmlns:oel="http://schemas.microsoft.com/office/2019/extlst" xmlns:r="http://schemas.openxmlformats.org/officeDocument/2006/relationships" xmlns:wp14="http://schemas.microsoft.com/office/word/2010/wordprocessingDrawing" xmlns:wp="http://schemas.openxmlformats.org/drawingml/2006/wordprocessingDrawing" xmlns:wpg="http://schemas.microsoft.com/office/word/2010/wordprocessingGroup" xmlns:wpi="http://schemas.microsoft.com/office/word/2010/wordprocessingInk" xmlns:wps="http://schemas.microsoft.com/office/word/2010/wordprocessingShape" xmlns:o="urn:schemas-microsoft-com:office:office" xmlns:v="urn:schemas-microsoft-com:vml" xmlns:w10="urn:schemas-microsoft-com:office:word" xmlns:w="http://schemas.openxmlformats.org/wordprocessingml/2006/main" xmlns:w14="http://schemas.microsoft.com/office/word/2010/wordml" xmlns:w15="http://schemas.microsoft.com/office/word/2012/wordml" xmlns:w16cex="http://schemas.microsoft.com/office/word/2018/wordml/cex" xmlns:w16cid="http://schemas.microsoft.com/office/word/2016/wordml/cid" xmlns:w16="http://schemas.microsoft.com/office/word/2018/wordml" xmlns:w16sdtdh="http://schemas.microsoft.com/office/word/2020/wordml/sdtdatahash" xmlns:w16sdtfl="http://schemas.microsoft.com/office/word/2024/wordml/sdtformatlock" xmlns:w16se="http://schemas.microsoft.com/office/word/2015/wordml/symex" xmlns:w16du="http://schemas.microsoft.com/office/word/2023/wordml/word16du" xmlns:wne="http://schemas.microsoft.com/office/word/2006/wordml" mc:Ignorable="w14 w15 w16se w16cid w16 w16cex w16sdtdh w16sdtfl w16du wp14">
   <w:p>
     <w:pPr>
       <w:pStyle w:val="Footer"/>
@@ -766,7 +766,7 @@
 </file>
 
 <file path=word/footnotes.xml><?xml version="1.0" encoding="utf-8"?>
-<w:footnotes xmlns:wpc="http://schemas.microsoft.com/office/word/2010/wordprocessingCanvas" xmlns:cx="http://schemas.microsoft.com/office/drawing/2014/chartex" xmlns:cx1="http://schemas.microsoft.com/office/drawing/2015/9/8/chartex" xmlns:cx2="http://schemas.microsoft.com/office/drawing/2015/10/21/chartex" xmlns:cx3="http://schemas.microsoft.com/office/drawing/2016/5/9/chartex" xmlns:cx4="http://schemas.microsoft.com/office/drawing/2016/5/10/chartex" xmlns:cx5="http://schemas.microsoft.com/office/drawing/2016/5/11/chartex" xmlns:cx6="http://schemas.microsoft.com/office/drawing/2016/5/12/chartex" xmlns:cx7="http://schemas.microsoft.com/office/drawing/2016/5/13/chartex" xmlns:cx8="http://schemas.microsoft.com/office/drawing/2016/5/14/chartex" xmlns:mc="http://schemas.openxmlformats.org/markup-compatibility/2006" xmlns:aink="http://schemas.microsoft.com/office/drawing/2016/ink" xmlns:am3d="http://schemas.microsoft.com/office/drawing/2017/model3d" xmlns:o="urn:schemas-microsoft-com:office:office" xmlns:oel="http://schemas.microsoft.com/office/2019/extlst" xmlns:r="http://schemas.openxmlformats.org/officeDocument/2006/relationships" xmlns:m="http://schemas.openxmlformats.org/officeDocument/2006/math" xmlns:v="urn:schemas-microsoft-com:vml" xmlns:wp14="http://schemas.microsoft.com/office/word/2010/wordprocessingDrawing" xmlns:wp="http://schemas.openxmlformats.org/drawingml/2006/wordprocessingDrawing" xmlns:w10="urn:schemas-microsoft-com:office:word" xmlns:w="http://schemas.openxmlformats.org/wordprocessingml/2006/main" xmlns:w14="http://schemas.microsoft.com/office/word/2010/wordml" xmlns:w15="http://schemas.microsoft.com/office/word/2012/wordml" xmlns:w16cex="http://schemas.microsoft.com/office/word/2018/wordml/cex" xmlns:w16cid="http://schemas.microsoft.com/office/word/2016/wordml/cid" xmlns:w16="http://schemas.microsoft.com/office/word/2018/wordml" xmlns:w16du="http://schemas.microsoft.com/office/word/2023/wordml/word16du" xmlns:w16sdtdh="http://schemas.microsoft.com/office/word/2020/wordml/sdtdatahash" xmlns:w16sdtfl="http://schemas.microsoft.com/office/word/2024/wordml/sdtformatlock" xmlns:w16se="http://schemas.microsoft.com/office/word/2015/wordml/symex" xmlns:wpg="http://schemas.microsoft.com/office/word/2010/wordprocessingGroup" xmlns:wpi="http://schemas.microsoft.com/office/word/2010/wordprocessingInk" xmlns:wne="http://schemas.microsoft.com/office/word/2006/wordml" xmlns:wps="http://schemas.microsoft.com/office/word/2010/wordprocessingShape" mc:Ignorable="w14 w15 w16se w16cid w16 w16cex w16sdtdh w16sdtfl w16du wp14">
+<w:footnotes xmlns:wpc="http://schemas.microsoft.com/office/word/2010/wordprocessingCanvas" xmlns:cx="http://schemas.microsoft.com/office/drawing/2014/chartex" xmlns:cx1="http://schemas.microsoft.com/office/drawing/2015/9/8/chartex" xmlns:cx2="http://schemas.microsoft.com/office/drawing/2015/10/21/chartex" xmlns:cx3="http://schemas.microsoft.com/office/drawing/2016/5/9/chartex" xmlns:cx4="http://schemas.microsoft.com/office/drawing/2016/5/10/chartex" xmlns:cx5="http://schemas.microsoft.com/office/drawing/2016/5/11/chartex" xmlns:cx6="http://schemas.microsoft.com/office/drawing/2016/5/12/chartex" xmlns:cx7="http://schemas.microsoft.com/office/drawing/2016/5/13/chartex" xmlns:cx8="http://schemas.microsoft.com/office/drawing/2016/5/14/chartex" xmlns:mc="http://schemas.openxmlformats.org/markup-compatibility/2006" xmlns:m="http://schemas.openxmlformats.org/officeDocument/2006/math" xmlns:aink="http://schemas.microsoft.com/office/drawing/2016/ink" xmlns:am3d="http://schemas.microsoft.com/office/drawing/2017/model3d" xmlns:oel="http://schemas.microsoft.com/office/2019/extlst" xmlns:r="http://schemas.openxmlformats.org/officeDocument/2006/relationships" xmlns:wp14="http://schemas.microsoft.com/office/word/2010/wordprocessingDrawing" xmlns:wp="http://schemas.openxmlformats.org/drawingml/2006/wordprocessingDrawing" xmlns:wpg="http://schemas.microsoft.com/office/word/2010/wordprocessingGroup" xmlns:wpi="http://schemas.microsoft.com/office/word/2010/wordprocessingInk" xmlns:wps="http://schemas.microsoft.com/office/word/2010/wordprocessingShape" xmlns:o="urn:schemas-microsoft-com:office:office" xmlns:v="urn:schemas-microsoft-com:vml" xmlns:w10="urn:schemas-microsoft-com:office:word" xmlns:w="http://schemas.openxmlformats.org/wordprocessingml/2006/main" xmlns:w14="http://schemas.microsoft.com/office/word/2010/wordml" xmlns:w15="http://schemas.microsoft.com/office/word/2012/wordml" xmlns:w16cex="http://schemas.microsoft.com/office/word/2018/wordml/cex" xmlns:w16cid="http://schemas.microsoft.com/office/word/2016/wordml/cid" xmlns:w16="http://schemas.microsoft.com/office/word/2018/wordml" xmlns:w16sdtdh="http://schemas.microsoft.com/office/word/2020/wordml/sdtdatahash" xmlns:w16sdtfl="http://schemas.microsoft.com/office/word/2024/wordml/sdtformatlock" xmlns:w16se="http://schemas.microsoft.com/office/word/2015/wordml/symex" xmlns:w16du="http://schemas.microsoft.com/office/word/2023/wordml/word16du" xmlns:wne="http://schemas.microsoft.com/office/word/2006/wordml" mc:Ignorable="w14 w15 w16se w16cid w16 w16cex w16sdtdh w16sdtfl w16du wp14">
   <w:footnote w:type="separator" w:id="-1">
     <w:p>
       <w:r>
@@ -800,7 +800,7 @@
 </file>
 
 <file path=word/numbering.xml><?xml version="1.0" encoding="utf-8"?>
-<w:numbering xmlns:wpc="http://schemas.microsoft.com/office/word/2010/wordprocessingCanvas" xmlns:cx="http://schemas.microsoft.com/office/drawing/2014/chartex" xmlns:cx1="http://schemas.microsoft.com/office/drawing/2015/9/8/chartex" xmlns:cx2="http://schemas.microsoft.com/office/drawing/2015/10/21/chartex" xmlns:cx3="http://schemas.microsoft.com/office/drawing/2016/5/9/chartex" xmlns:cx4="http://schemas.microsoft.com/office/drawing/2016/5/10/chartex" xmlns:cx5="http://schemas.microsoft.com/office/drawing/2016/5/11/chartex" xmlns:cx6="http://schemas.microsoft.com/office/drawing/2016/5/12/chartex" xmlns:cx7="http://schemas.microsoft.com/office/drawing/2016/5/13/chartex" xmlns:cx8="http://schemas.microsoft.com/office/drawing/2016/5/14/chartex" xmlns:mc="http://schemas.openxmlformats.org/markup-compatibility/2006" xmlns:aink="http://schemas.microsoft.com/office/drawing/2016/ink" xmlns:am3d="http://schemas.microsoft.com/office/drawing/2017/model3d" xmlns:o="urn:schemas-microsoft-com:office:office" xmlns:oel="http://schemas.microsoft.com/office/2019/extlst" xmlns:r="http://schemas.openxmlformats.org/officeDocument/2006/relationships" xmlns:m="http://schemas.openxmlformats.org/officeDocument/2006/math" xmlns:v="urn:schemas-microsoft-com:vml" xmlns:wp14="http://schemas.microsoft.com/office/word/2010/wordprocessingDrawing" xmlns:wp="http://schemas.openxmlformats.org/drawingml/2006/wordprocessingDrawing" xmlns:w10="urn:schemas-microsoft-com:office:word" xmlns:w="http://schemas.openxmlformats.org/wordprocessingml/2006/main" xmlns:w14="http://schemas.microsoft.com/office/word/2010/wordml" xmlns:w15="http://schemas.microsoft.com/office/word/2012/wordml" xmlns:w16cex="http://schemas.microsoft.com/office/word/2018/wordml/cex" xmlns:w16cid="http://schemas.microsoft.com/office/word/2016/wordml/cid" xmlns:w16="http://schemas.microsoft.com/office/word/2018/wordml" xmlns:w16du="http://schemas.microsoft.com/office/word/2023/wordml/word16du" xmlns:w16sdtdh="http://schemas.microsoft.com/office/word/2020/wordml/sdtdatahash" xmlns:w16sdtfl="http://schemas.microsoft.com/office/word/2024/wordml/sdtformatlock" xmlns:w16se="http://schemas.microsoft.com/office/word/2015/wordml/symex" xmlns:wpg="http://schemas.microsoft.com/office/word/2010/wordprocessingGroup" xmlns:wpi="http://schemas.microsoft.com/office/word/2010/wordprocessingInk" xmlns:wne="http://schemas.microsoft.com/office/word/2006/wordml" xmlns:wps="http://schemas.microsoft.com/office/word/2010/wordprocessingShape" mc:Ignorable="w14 w15 w16se w16cid w16 w16cex w16sdtdh w16sdtfl w16du wp14">
+<w:numbering xmlns:wpc="http://schemas.microsoft.com/office/word/2010/wordprocessingCanvas" xmlns:cx="http://schemas.microsoft.com/office/drawing/2014/chartex" xmlns:cx1="http://schemas.microsoft.com/office/drawing/2015/9/8/chartex" xmlns:cx2="http://schemas.microsoft.com/office/drawing/2015/10/21/chartex" xmlns:cx3="http://schemas.microsoft.com/office/drawing/2016/5/9/chartex" xmlns:cx4="http://schemas.microsoft.com/office/drawing/2016/5/10/chartex" xmlns:cx5="http://schemas.microsoft.com/office/drawing/2016/5/11/chartex" xmlns:cx6="http://schemas.microsoft.com/office/drawing/2016/5/12/chartex" xmlns:cx7="http://schemas.microsoft.com/office/drawing/2016/5/13/chartex" xmlns:cx8="http://schemas.microsoft.com/office/drawing/2016/5/14/chartex" xmlns:mc="http://schemas.openxmlformats.org/markup-compatibility/2006" xmlns:m="http://schemas.openxmlformats.org/officeDocument/2006/math" xmlns:aink="http://schemas.microsoft.com/office/drawing/2016/ink" xmlns:am3d="http://schemas.microsoft.com/office/drawing/2017/model3d" xmlns:oel="http://schemas.microsoft.com/office/2019/extlst" xmlns:r="http://schemas.openxmlformats.org/officeDocument/2006/relationships" xmlns:wp14="http://schemas.microsoft.com/office/word/2010/wordprocessingDrawing" xmlns:wp="http://schemas.openxmlformats.org/drawingml/2006/wordprocessingDrawing" xmlns:wpg="http://schemas.microsoft.com/office/word/2010/wordprocessingGroup" xmlns:wpi="http://schemas.microsoft.com/office/word/2010/wordprocessingInk" xmlns:wps="http://schemas.microsoft.com/office/word/2010/wordprocessingShape" xmlns:o="urn:schemas-microsoft-com:office:office" xmlns:v="urn:schemas-microsoft-com:vml" xmlns:w10="urn:schemas-microsoft-com:office:word" xmlns:w="http://schemas.openxmlformats.org/wordprocessingml/2006/main" xmlns:w14="http://schemas.microsoft.com/office/word/2010/wordml" xmlns:w15="http://schemas.microsoft.com/office/word/2012/wordml" xmlns:w16cex="http://schemas.microsoft.com/office/word/2018/wordml/cex" xmlns:w16cid="http://schemas.microsoft.com/office/word/2016/wordml/cid" xmlns:w16="http://schemas.microsoft.com/office/word/2018/wordml" xmlns:w16sdtdh="http://schemas.microsoft.com/office/word/2020/wordml/sdtdatahash" xmlns:w16sdtfl="http://schemas.microsoft.com/office/word/2024/wordml/sdtformatlock" xmlns:w16se="http://schemas.microsoft.com/office/word/2015/wordml/symex" xmlns:w16du="http://schemas.microsoft.com/office/word/2023/wordml/word16du" xmlns:wne="http://schemas.microsoft.com/office/word/2006/wordml" mc:Ignorable="w14 w15 w16se w16cid w16 w16cex w16sdtdh w16sdtfl w16du wp14">
   <w:abstractNum w:abstractNumId="0" w15:restartNumberingAfterBreak="0">
     <w:nsid w:val="FFFFFF7F"/>
     <w:multiLevelType w:val="singleLevel"/>
@@ -3018,7 +3018,7 @@
 </file>
 
 <file path=word/styles.xml><?xml version="1.0" encoding="utf-8"?>
-<w:styles xmlns:mc="http://schemas.openxmlformats.org/markup-compatibility/2006" xmlns:r="http://schemas.openxmlformats.org/officeDocument/2006/relationships" xmlns:w="http://schemas.openxmlformats.org/wordprocessingml/2006/main" xmlns:w14="http://schemas.microsoft.com/office/word/2010/wordml" xmlns:w15="http://schemas.microsoft.com/office/word/2012/wordml" xmlns:w16cex="http://schemas.microsoft.com/office/word/2018/wordml/cex" xmlns:w16cid="http://schemas.microsoft.com/office/word/2016/wordml/cid" xmlns:w16="http://schemas.microsoft.com/office/word/2018/wordml" xmlns:w16du="http://schemas.microsoft.com/office/word/2023/wordml/word16du" xmlns:w16sdtdh="http://schemas.microsoft.com/office/word/2020/wordml/sdtdatahash" xmlns:w16sdtfl="http://schemas.microsoft.com/office/word/2024/wordml/sdtformatlock" xmlns:w16se="http://schemas.microsoft.com/office/word/2015/wordml/symex" mc:Ignorable="w14 w15 w16se w16cid w16 w16cex w16sdtdh w16sdtfl w16du">
+<w:styles xmlns:mc="http://schemas.openxmlformats.org/markup-compatibility/2006" xmlns:r="http://schemas.openxmlformats.org/officeDocument/2006/relationships" xmlns:w="http://schemas.openxmlformats.org/wordprocessingml/2006/main" xmlns:w14="http://schemas.microsoft.com/office/word/2010/wordml" xmlns:w15="http://schemas.microsoft.com/office/word/2012/wordml" xmlns:w16cex="http://schemas.microsoft.com/office/word/2018/wordml/cex" xmlns:w16cid="http://schemas.microsoft.com/office/word/2016/wordml/cid" xmlns:w16="http://schemas.microsoft.com/office/word/2018/wordml" xmlns:w16sdtdh="http://schemas.microsoft.com/office/word/2020/wordml/sdtdatahash" xmlns:w16sdtfl="http://schemas.microsoft.com/office/word/2024/wordml/sdtformatlock" xmlns:w16se="http://schemas.microsoft.com/office/word/2015/wordml/symex" xmlns:w16du="http://schemas.microsoft.com/office/word/2023/wordml/word16du" mc:Ignorable="w14 w15 w16se w16cid w16 w16cex w16sdtdh w16sdtfl w16du">
   <w:docDefaults>
     <w:rPrDefault>
       <w:rPr>
@@ -4607,19 +4607,6 @@
 </file>
 
 <file path=customXml/item2.xml><?xml version="1.0" encoding="utf-8"?>
-<b:Sources xmlns:b="http://schemas.openxmlformats.org/officeDocument/2006/bibliography" xmlns="http://schemas.openxmlformats.org/officeDocument/2006/bibliography" SelectedStyle="\APASixthEditionOfficeOnline.xsl" StyleName="APA" Version="6"/>
-</file>
-
-<file path=customXml/item3.xml><?xml version="1.0" encoding="utf-8"?>
-<?mso-contentType ?>
-<FormTemplates xmlns="http://schemas.microsoft.com/sharepoint/v3/contenttype/forms">
-  <Display>DocumentLibraryForm</Display>
-  <Edit>DocumentLibraryForm</Edit>
-  <New>DocumentLibraryForm</New>
-</FormTemplates>
-</file>
-
-<file path=customXml/item4.xml><?xml version="1.0" encoding="utf-8"?>
 <ct:contentTypeSchema xmlns:ct="http://schemas.microsoft.com/office/2006/metadata/contentType" xmlns:ma="http://schemas.microsoft.com/office/2006/metadata/properties/metaAttributes" ct:_="" ma:_="" ma:contentTypeName="Document" ma:contentTypeID="0x0101009044A84E23759B4B87F3709C73402C4A" ma:contentTypeVersion="15" ma:contentTypeDescription="Create a new document." ma:contentTypeScope="" ma:versionID="9233f4bb4215c73a510003a9f072f138">
   <xsd:schema xmlns:xsd="http://www.w3.org/2001/XMLSchema" xmlns:xs="http://www.w3.org/2001/XMLSchema" xmlns:p="http://schemas.microsoft.com/office/2006/metadata/properties" xmlns:ns2="7562f8c3-e17b-4183-af27-c0ef091db4fe" xmlns:ns3="15335165-7242-4578-b7f0-21dda5d4421e" targetNamespace="http://schemas.microsoft.com/office/2006/metadata/properties" ma:root="true" ma:fieldsID="2cbbccbe6583eca55ddc0605d4581f42" ns2:_="" ns3:_="">
     <xsd:import namespace="7562f8c3-e17b-4183-af27-c0ef091db4fe"/>
@@ -4856,6 +4843,19 @@
 </ct:contentTypeSchema>
 </file>
 
+<file path=customXml/item3.xml><?xml version="1.0" encoding="utf-8"?>
+<?mso-contentType ?>
+<FormTemplates xmlns="http://schemas.microsoft.com/sharepoint/v3/contenttype/forms">
+  <Display>DocumentLibraryForm</Display>
+  <Edit>DocumentLibraryForm</Edit>
+  <New>DocumentLibraryForm</New>
+</FormTemplates>
+</file>
+
+<file path=customXml/item4.xml><?xml version="1.0" encoding="utf-8"?>
+<b:Sources xmlns:b="http://schemas.openxmlformats.org/officeDocument/2006/bibliography" xmlns="http://schemas.openxmlformats.org/officeDocument/2006/bibliography" SelectedStyle="\APASixthEditionOfficeOnline.xsl" StyleName="APA" Version="6"/>
+</file>
+
 <file path=customXml/itemProps1.xml><?xml version="1.0" encoding="utf-8"?>
 <ds:datastoreItem xmlns:ds="http://schemas.openxmlformats.org/officeDocument/2006/customXml" ds:itemID="{1ED8A1FF-FADA-4751-815F-2BD5A1884232}">
   <ds:schemaRefs>
@@ -4868,22 +4868,6 @@
 </file>
 
 <file path=customXml/itemProps2.xml><?xml version="1.0" encoding="utf-8"?>
-<ds:datastoreItem xmlns:ds="http://schemas.openxmlformats.org/officeDocument/2006/customXml" ds:itemID="{7D796DE4-8113-4C1F-A1EB-77B2BCA2630C}">
-  <ds:schemaRefs>
-    <ds:schemaRef ds:uri="http://schemas.openxmlformats.org/officeDocument/2006/bibliography"/>
-  </ds:schemaRefs>
-</ds:datastoreItem>
-</file>
-
-<file path=customXml/itemProps3.xml><?xml version="1.0" encoding="utf-8"?>
-<ds:datastoreItem xmlns:ds="http://schemas.openxmlformats.org/officeDocument/2006/customXml" ds:itemID="{F96B9AE6-015B-4478-A2E2-D7A8159C2E27}">
-  <ds:schemaRefs>
-    <ds:schemaRef ds:uri="http://schemas.microsoft.com/sharepoint/v3/contenttype/forms"/>
-  </ds:schemaRefs>
-</ds:datastoreItem>
-</file>
-
-<file path=customXml/itemProps4.xml><?xml version="1.0" encoding="utf-8"?>
 <ds:datastoreItem xmlns:ds="http://schemas.openxmlformats.org/officeDocument/2006/customXml" ds:itemID="{80939AD2-6BE1-43E9-82E6-4181E69629A8}">
   <ds:schemaRefs>
     <ds:schemaRef ds:uri="http://schemas.microsoft.com/office/2006/metadata/contentType"/>
@@ -4900,4 +4884,20 @@
     <ds:schemaRef ds:uri="http://schemas.microsoft.com/internal/obd"/>
   </ds:schemaRefs>
 </ds:datastoreItem>
+</file>
+
+<file path=customXml/itemProps3.xml><?xml version="1.0" encoding="utf-8"?>
+<ds:datastoreItem xmlns:ds="http://schemas.openxmlformats.org/officeDocument/2006/customXml" ds:itemID="{F96B9AE6-015B-4478-A2E2-D7A8159C2E27}">
+  <ds:schemaRefs>
+    <ds:schemaRef ds:uri="http://schemas.microsoft.com/sharepoint/v3/contenttype/forms"/>
+  </ds:schemaRefs>
+</ds:datastoreItem>
+</file>
+
+<file path=customXml/itemProps4.xml><?xml version="1.0" encoding="utf-8"?>
+<ds:datastoreItem xmlns:ds="http://schemas.openxmlformats.org/officeDocument/2006/customXml" ds:itemID="{7D796DE4-8113-4C1F-A1EB-77B2BCA2630C}">
+  <ds:schemaRefs>
+    <ds:schemaRef ds:uri="http://schemas.openxmlformats.org/officeDocument/2006/bibliography"/>
+  </ds:schemaRefs>
+</ds:datastoreItem>
 </file>
</xml_diff>